<commit_message>
Update CMS guide with deploy delay
</commit_message>
<xml_diff>
--- a/docs/cms-user-guide.docx
+++ b/docs/cms-user-guide.docx
@@ -1,6 +1,6 @@
 
 <file path=word/document.xml><?xml version="1.0" encoding="utf-8"?>
-<w:document xmlns:w="http://schemas.openxmlformats.org/wordprocessingml/2006/main" xmlns:r="http://schemas.openxmlformats.org/officeDocument/2006/relationships" xmlns:wp="http://schemas.openxmlformats.org/drawingml/2006/wordprocessingDrawing">
+<w:document xmlns:ns1="http://schemas.openxmlformats.org/drawingml/2006/wordprocessingDrawing" xmlns:ns2="http://schemas.openxmlformats.org/drawingml/2006/main" xmlns:ns3="http://schemas.openxmlformats.org/drawingml/2006/picture" xmlns:ns4="http://schemas.openxmlformats.org/officeDocument/2006/relationships" xmlns:w="http://schemas.openxmlformats.org/wordprocessingml/2006/main">
   <w:body>
     <w:p>
       <w:pPr>
@@ -29,14 +29,13 @@
       </w:r>
     </w:p>
     <w:p>
-      <w:pPr>
-        <w:shd w:fill="F3F4F6"/>
-      </w:pPr>
-      <w:r>
-        <w:rPr>
-          <w:rFonts w:ascii="Courier New" w:hAnsi="Courier New"/>
-        </w:rPr>
-        <w:t xml:space="preserve">http://localhost:3000/admin</w:t>
+      <w:r>
+        <w:t>Production: https://www.shalmolymondal.com/admin</w:t>
+      </w:r>
+    </w:p>
+    <w:p>
+      <w:r>
+        <w:t>Local development: http://localhost:3000/admin</w:t>
       </w:r>
     </w:p>
     <w:p>
@@ -69,14 +68,13 @@
       </w:r>
     </w:p>
     <w:p>
-      <w:pPr>
-        <w:shd w:fill="F3F4F6"/>
-      </w:pPr>
-      <w:r>
-        <w:rPr>
-          <w:rFonts w:ascii="Courier New" w:hAnsi="Courier New"/>
-        </w:rPr>
-        <w:t xml:space="preserve">http://localhost:3000/admin</w:t>
+      <w:r>
+        <w:t>Production: https://www.shalmolymondal.com/admin</w:t>
+      </w:r>
+    </w:p>
+    <w:p>
+      <w:r>
+        <w:t>Local development: http://localhost:3000/admin</w:t>
       </w:r>
     </w:p>
     <w:p>
@@ -103,35 +101,35 @@
     <w:p>
       <w:r>
         <w:drawing>
-          <wp:inline xmlns:wp="http://schemas.openxmlformats.org/drawingml/2006/wordprocessingDrawing" distT="0" distB="0" distL="0" distR="0">
-            <wp:extent cx="5486400" cy="3086100"/>
-            <wp:docPr id="1" name="CMS login screen"/>
-            <a:graphic xmlns:a="http://schemas.openxmlformats.org/drawingml/2006/main">
-              <a:graphicData uri="http://schemas.openxmlformats.org/drawingml/2006/picture">
-                <pic:pic xmlns:pic="http://schemas.openxmlformats.org/drawingml/2006/picture">
-                  <pic:nvPicPr>
-                    <pic:cNvPr id="0" name="cms-login.png"/>
-                    <pic:cNvPicPr/>
-                  </pic:nvPicPr>
-                  <pic:blipFill>
-                    <a:blip xmlns:r="http://schemas.openxmlformats.org/officeDocument/2006/relationships" r:embed="rId1"/>
-                    <a:stretch>
-                      <a:fillRect/>
-                    </a:stretch>
-                  </pic:blipFill>
-                  <pic:spPr>
-                    <a:xfrm>
-                      <a:off x="0" y="0"/>
-                      <a:ext cx="5486400" cy="3086100"/>
-                    </a:xfrm>
-                    <a:prstGeom prst="rect">
-                      <a:avLst/>
-                    </a:prstGeom>
-                  </pic:spPr>
-                </pic:pic>
-              </a:graphicData>
-            </a:graphic>
-          </wp:inline>
+          <ns1:inline distT="0" distB="0" distL="0" distR="0">
+            <ns1:extent cx="5486400" cy="3086100"/>
+            <ns1:docPr id="1" name="CMS login screen"/>
+            <ns2:graphic>
+              <ns2:graphicData uri="http://schemas.openxmlformats.org/drawingml/2006/picture">
+                <ns3:pic>
+                  <ns3:nvPicPr>
+                    <ns3:cNvPr id="0" name="cms-login.png"/>
+                    <ns3:cNvPicPr/>
+                  </ns3:nvPicPr>
+                  <ns3:blipFill>
+                    <ns2:blip ns4:embed="rId1"/>
+                    <ns2:stretch>
+                      <ns2:fillRect/>
+                    </ns2:stretch>
+                  </ns3:blipFill>
+                  <ns3:spPr>
+                    <ns2:xfrm>
+                      <ns2:off x="0" y="0"/>
+                      <ns2:ext cx="5486400" cy="3086100"/>
+                    </ns2:xfrm>
+                    <ns2:prstGeom prst="rect">
+                      <ns2:avLst/>
+                    </ns2:prstGeom>
+                  </ns3:spPr>
+                </ns3:pic>
+              </ns2:graphicData>
+            </ns2:graphic>
+          </ns1:inline>
         </w:drawing>
       </w:r>
     </w:p>
@@ -148,35 +146,35 @@
     <w:p>
       <w:r>
         <w:drawing>
-          <wp:inline xmlns:wp="http://schemas.openxmlformats.org/drawingml/2006/wordprocessingDrawing" distT="0" distB="0" distL="0" distR="0">
-            <wp:extent cx="5486400" cy="3086100"/>
-            <wp:docPr id="2" name="CMS site tab"/>
-            <a:graphic xmlns:a="http://schemas.openxmlformats.org/drawingml/2006/main">
-              <a:graphicData uri="http://schemas.openxmlformats.org/drawingml/2006/picture">
-                <pic:pic xmlns:pic="http://schemas.openxmlformats.org/drawingml/2006/picture">
-                  <pic:nvPicPr>
-                    <pic:cNvPr id="0" name="cms-site-tab.png"/>
-                    <pic:cNvPicPr/>
-                  </pic:nvPicPr>
-                  <pic:blipFill>
-                    <a:blip xmlns:r="http://schemas.openxmlformats.org/officeDocument/2006/relationships" r:embed="rId2"/>
-                    <a:stretch>
-                      <a:fillRect/>
-                    </a:stretch>
-                  </pic:blipFill>
-                  <pic:spPr>
-                    <a:xfrm>
-                      <a:off x="0" y="0"/>
-                      <a:ext cx="5486400" cy="3086100"/>
-                    </a:xfrm>
-                    <a:prstGeom prst="rect">
-                      <a:avLst/>
-                    </a:prstGeom>
-                  </pic:spPr>
-                </pic:pic>
-              </a:graphicData>
-            </a:graphic>
-          </wp:inline>
+          <ns1:inline distT="0" distB="0" distL="0" distR="0">
+            <ns1:extent cx="5486400" cy="3086100"/>
+            <ns1:docPr id="2" name="CMS site tab"/>
+            <ns2:graphic>
+              <ns2:graphicData uri="http://schemas.openxmlformats.org/drawingml/2006/picture">
+                <ns3:pic>
+                  <ns3:nvPicPr>
+                    <ns3:cNvPr id="0" name="cms-site-tab.png"/>
+                    <ns3:cNvPicPr/>
+                  </ns3:nvPicPr>
+                  <ns3:blipFill>
+                    <ns2:blip ns4:embed="rId2"/>
+                    <ns2:stretch>
+                      <ns2:fillRect/>
+                    </ns2:stretch>
+                  </ns3:blipFill>
+                  <ns3:spPr>
+                    <ns2:xfrm>
+                      <ns2:off x="0" y="0"/>
+                      <ns2:ext cx="5486400" cy="3086100"/>
+                    </ns2:xfrm>
+                    <ns2:prstGeom prst="rect">
+                      <ns2:avLst/>
+                    </ns2:prstGeom>
+                  </ns3:spPr>
+                </ns3:pic>
+              </ns2:graphicData>
+            </ns2:graphic>
+          </ns1:inline>
         </w:drawing>
       </w:r>
     </w:p>
@@ -293,11 +291,13 @@
       </w:r>
     </w:p>
     <w:p>
-      <w:pPr>
-        <w:pStyle w:val="ListParagraph"/>
-      </w:pPr>
-      <w:r>
-        <w:t xml:space="preserve">• Wait for: Saved. Public pages have been revalidated.</w:t>
+      <w:r>
+        <w:t>• Wait for the save confirmation. In production, the message should say the CMS saved and committed data/portfolio.json to GitHub main.</w:t>
+      </w:r>
+    </w:p>
+    <w:p>
+      <w:r>
+        <w:t>• Production deploy is not instant. After Save changes, Vercel starts a new deployment from the GitHub commit. The public website usually updates after about 1-3 minutes.</w:t>
       </w:r>
     </w:p>
     <w:p>
@@ -310,10 +310,20 @@
     </w:p>
     <w:p>
       <w:r>
+        <w:t>• During that deployment window, the CMS save can already be complete while the public website still shows the previous content. Refresh the public page after the Vercel deployment finishes.</w:t>
+      </w:r>
+    </w:p>
+    <w:p>
+      <w:r>
         <w:t xml:space="preserve">CMS changes are stored in:</w:t>
       </w:r>
     </w:p>
     <w:p>
+      <w:r>
+        <w:t>• For a visible check, edit a small public text field, save it, wait for the deploy delay, confirm it appears on the public site, then continue with the rest of the updates.</w:t>
+      </w:r>
+    </w:p>
+    <w:p>
       <w:pPr>
         <w:shd w:fill="F3F4F6"/>
       </w:pPr>
@@ -340,35 +350,35 @@
     <w:p>
       <w:r>
         <w:drawing>
-          <wp:inline xmlns:wp="http://schemas.openxmlformats.org/drawingml/2006/wordprocessingDrawing" distT="0" distB="0" distL="0" distR="0">
-            <wp:extent cx="5486400" cy="3086100"/>
-            <wp:docPr id="3" name="CMS projects tab"/>
-            <a:graphic xmlns:a="http://schemas.openxmlformats.org/drawingml/2006/main">
-              <a:graphicData uri="http://schemas.openxmlformats.org/drawingml/2006/picture">
-                <pic:pic xmlns:pic="http://schemas.openxmlformats.org/drawingml/2006/picture">
-                  <pic:nvPicPr>
-                    <pic:cNvPr id="0" name="cms-projects-tab.png"/>
-                    <pic:cNvPicPr/>
-                  </pic:nvPicPr>
-                  <pic:blipFill>
-                    <a:blip xmlns:r="http://schemas.openxmlformats.org/officeDocument/2006/relationships" r:embed="rId3"/>
-                    <a:stretch>
-                      <a:fillRect/>
-                    </a:stretch>
-                  </pic:blipFill>
-                  <pic:spPr>
-                    <a:xfrm>
-                      <a:off x="0" y="0"/>
-                      <a:ext cx="5486400" cy="3086100"/>
-                    </a:xfrm>
-                    <a:prstGeom prst="rect">
-                      <a:avLst/>
-                    </a:prstGeom>
-                  </pic:spPr>
-                </pic:pic>
-              </a:graphicData>
-            </a:graphic>
-          </wp:inline>
+          <ns1:inline distT="0" distB="0" distL="0" distR="0">
+            <ns1:extent cx="5486400" cy="3086100"/>
+            <ns1:docPr id="3" name="CMS projects tab"/>
+            <ns2:graphic>
+              <ns2:graphicData uri="http://schemas.openxmlformats.org/drawingml/2006/picture">
+                <ns3:pic>
+                  <ns3:nvPicPr>
+                    <ns3:cNvPr id="0" name="cms-projects-tab.png"/>
+                    <ns3:cNvPicPr/>
+                  </ns3:nvPicPr>
+                  <ns3:blipFill>
+                    <ns2:blip ns4:embed="rId3"/>
+                    <ns2:stretch>
+                      <ns2:fillRect/>
+                    </ns2:stretch>
+                  </ns3:blipFill>
+                  <ns3:spPr>
+                    <ns2:xfrm>
+                      <ns2:off x="0" y="0"/>
+                      <ns2:ext cx="5486400" cy="3086100"/>
+                    </ns2:xfrm>
+                    <ns2:prstGeom prst="rect">
+                      <ns2:avLst/>
+                    </ns2:prstGeom>
+                  </ns3:spPr>
+                </ns3:pic>
+              </ns2:graphicData>
+            </ns2:graphic>
+          </ns1:inline>
         </w:drawing>
       </w:r>
     </w:p>
@@ -455,35 +465,35 @@
     <w:p>
       <w:r>
         <w:drawing>
-          <wp:inline xmlns:wp="http://schemas.openxmlformats.org/drawingml/2006/wordprocessingDrawing" distT="0" distB="0" distL="0" distR="0">
-            <wp:extent cx="5486400" cy="3086100"/>
-            <wp:docPr id="4" name="CMS research tab"/>
-            <a:graphic xmlns:a="http://schemas.openxmlformats.org/drawingml/2006/main">
-              <a:graphicData uri="http://schemas.openxmlformats.org/drawingml/2006/picture">
-                <pic:pic xmlns:pic="http://schemas.openxmlformats.org/drawingml/2006/picture">
-                  <pic:nvPicPr>
-                    <pic:cNvPr id="0" name="cms-research-tab.png"/>
-                    <pic:cNvPicPr/>
-                  </pic:nvPicPr>
-                  <pic:blipFill>
-                    <a:blip xmlns:r="http://schemas.openxmlformats.org/officeDocument/2006/relationships" r:embed="rId4"/>
-                    <a:stretch>
-                      <a:fillRect/>
-                    </a:stretch>
-                  </pic:blipFill>
-                  <pic:spPr>
-                    <a:xfrm>
-                      <a:off x="0" y="0"/>
-                      <a:ext cx="5486400" cy="3086100"/>
-                    </a:xfrm>
-                    <a:prstGeom prst="rect">
-                      <a:avLst/>
-                    </a:prstGeom>
-                  </pic:spPr>
-                </pic:pic>
-              </a:graphicData>
-            </a:graphic>
-          </wp:inline>
+          <ns1:inline distT="0" distB="0" distL="0" distR="0">
+            <ns1:extent cx="5486400" cy="3086100"/>
+            <ns1:docPr id="4" name="CMS research tab"/>
+            <ns2:graphic>
+              <ns2:graphicData uri="http://schemas.openxmlformats.org/drawingml/2006/picture">
+                <ns3:pic>
+                  <ns3:nvPicPr>
+                    <ns3:cNvPr id="0" name="cms-research-tab.png"/>
+                    <ns3:cNvPicPr/>
+                  </ns3:nvPicPr>
+                  <ns3:blipFill>
+                    <ns2:blip ns4:embed="rId4"/>
+                    <ns2:stretch>
+                      <ns2:fillRect/>
+                    </ns2:stretch>
+                  </ns3:blipFill>
+                  <ns3:spPr>
+                    <ns2:xfrm>
+                      <ns2:off x="0" y="0"/>
+                      <ns2:ext cx="5486400" cy="3086100"/>
+                    </ns2:xfrm>
+                    <ns2:prstGeom prst="rect">
+                      <ns2:avLst/>
+                    </ns2:prstGeom>
+                  </ns3:spPr>
+                </ns3:pic>
+              </ns2:graphicData>
+            </ns2:graphic>
+          </ns1:inline>
         </w:drawing>
       </w:r>
     </w:p>
@@ -737,41 +747,46 @@
     </w:p>
     <w:p>
       <w:r>
+        <w:t>On production, allow the Vercel deployment delay before judging whether a saved CMS edit is visible.</w:t>
+      </w:r>
+    </w:p>
+    <w:p>
+      <w:r>
         <w:t xml:space="preserve">Public work page example</w:t>
       </w:r>
     </w:p>
     <w:p>
       <w:r>
         <w:drawing>
-          <wp:inline xmlns:wp="http://schemas.openxmlformats.org/drawingml/2006/wordprocessingDrawing" distT="0" distB="0" distL="0" distR="0">
-            <wp:extent cx="5486400" cy="3086100"/>
-            <wp:docPr id="6" name="Public work page example"/>
-            <a:graphic xmlns:a="http://schemas.openxmlformats.org/drawingml/2006/main">
-              <a:graphicData uri="http://schemas.openxmlformats.org/drawingml/2006/picture">
-                <pic:pic xmlns:pic="http://schemas.openxmlformats.org/drawingml/2006/picture">
-                  <pic:nvPicPr>
-                    <pic:cNvPr id="0" name="public-work-page.png"/>
-                    <pic:cNvPicPr/>
-                  </pic:nvPicPr>
-                  <pic:blipFill>
-                    <a:blip xmlns:r="http://schemas.openxmlformats.org/officeDocument/2006/relationships" r:embed="rId6"/>
-                    <a:stretch>
-                      <a:fillRect/>
-                    </a:stretch>
-                  </pic:blipFill>
-                  <pic:spPr>
-                    <a:xfrm>
-                      <a:off x="0" y="0"/>
-                      <a:ext cx="5486400" cy="3086100"/>
-                    </a:xfrm>
-                    <a:prstGeom prst="rect">
-                      <a:avLst/>
-                    </a:prstGeom>
-                  </pic:spPr>
-                </pic:pic>
-              </a:graphicData>
-            </a:graphic>
-          </wp:inline>
+          <ns1:inline distT="0" distB="0" distL="0" distR="0">
+            <ns1:extent cx="5486400" cy="3086100"/>
+            <ns1:docPr id="6" name="Public work page example"/>
+            <ns2:graphic>
+              <ns2:graphicData uri="http://schemas.openxmlformats.org/drawingml/2006/picture">
+                <ns3:pic>
+                  <ns3:nvPicPr>
+                    <ns3:cNvPr id="0" name="public-work-page.png"/>
+                    <ns3:cNvPicPr/>
+                  </ns3:nvPicPr>
+                  <ns3:blipFill>
+                    <ns2:blip ns4:embed="rId6"/>
+                    <ns2:stretch>
+                      <ns2:fillRect/>
+                    </ns2:stretch>
+                  </ns3:blipFill>
+                  <ns3:spPr>
+                    <ns2:xfrm>
+                      <ns2:off x="0" y="0"/>
+                      <ns2:ext cx="5486400" cy="3086100"/>
+                    </ns2:xfrm>
+                    <ns2:prstGeom prst="rect">
+                      <ns2:avLst/>
+                    </ns2:prstGeom>
+                  </ns3:spPr>
+                </ns3:pic>
+              </ns2:graphicData>
+            </ns2:graphic>
+          </ns1:inline>
         </w:drawing>
       </w:r>
     </w:p>
@@ -796,35 +811,35 @@
     <w:p>
       <w:r>
         <w:drawing>
-          <wp:inline xmlns:wp="http://schemas.openxmlformats.org/drawingml/2006/wordprocessingDrawing" distT="0" distB="0" distL="0" distR="0">
-            <wp:extent cx="5486400" cy="3086100"/>
-            <wp:docPr id="5" name="CMS JSON tab"/>
-            <a:graphic xmlns:a="http://schemas.openxmlformats.org/drawingml/2006/main">
-              <a:graphicData uri="http://schemas.openxmlformats.org/drawingml/2006/picture">
-                <pic:pic xmlns:pic="http://schemas.openxmlformats.org/drawingml/2006/picture">
-                  <pic:nvPicPr>
-                    <pic:cNvPr id="0" name="cms-json-tab.png"/>
-                    <pic:cNvPicPr/>
-                  </pic:nvPicPr>
-                  <pic:blipFill>
-                    <a:blip xmlns:r="http://schemas.openxmlformats.org/officeDocument/2006/relationships" r:embed="rId5"/>
-                    <a:stretch>
-                      <a:fillRect/>
-                    </a:stretch>
-                  </pic:blipFill>
-                  <pic:spPr>
-                    <a:xfrm>
-                      <a:off x="0" y="0"/>
-                      <a:ext cx="5486400" cy="3086100"/>
-                    </a:xfrm>
-                    <a:prstGeom prst="rect">
-                      <a:avLst/>
-                    </a:prstGeom>
-                  </pic:spPr>
-                </pic:pic>
-              </a:graphicData>
-            </a:graphic>
-          </wp:inline>
+          <ns1:inline distT="0" distB="0" distL="0" distR="0">
+            <ns1:extent cx="5486400" cy="3086100"/>
+            <ns1:docPr id="5" name="CMS JSON tab"/>
+            <ns2:graphic>
+              <ns2:graphicData uri="http://schemas.openxmlformats.org/drawingml/2006/picture">
+                <ns3:pic>
+                  <ns3:nvPicPr>
+                    <ns3:cNvPr id="0" name="cms-json-tab.png"/>
+                    <ns3:cNvPicPr/>
+                  </ns3:nvPicPr>
+                  <ns3:blipFill>
+                    <ns2:blip ns4:embed="rId5"/>
+                    <ns2:stretch>
+                      <ns2:fillRect/>
+                    </ns2:stretch>
+                  </ns3:blipFill>
+                  <ns3:spPr>
+                    <ns2:xfrm>
+                      <ns2:off x="0" y="0"/>
+                      <ns2:ext cx="5486400" cy="3086100"/>
+                    </ns2:xfrm>
+                    <ns2:prstGeom prst="rect">
+                      <ns2:avLst/>
+                    </ns2:prstGeom>
+                  </ns3:spPr>
+                </ns3:pic>
+              </ns2:graphicData>
+            </ns2:graphic>
+          </ns1:inline>
         </w:drawing>
       </w:r>
     </w:p>
@@ -1074,11 +1089,21 @@
       </w:r>
     </w:p>
     <w:p>
+      <w:r>
+        <w:t>• In production, Save changes commits data/portfolio.json to GitHub main and Vercel redeploys the site from that commit.</w:t>
+      </w:r>
+    </w:p>
+    <w:p>
       <w:pPr>
         <w:pStyle w:val="ListParagraph"/>
       </w:pPr>
       <w:r>
         <w:t xml:space="preserve">• /admin is the CMS route.</w:t>
+      </w:r>
+    </w:p>
+    <w:p>
+      <w:r>
+        <w:t>• A successful CMS save may take around 1-3 minutes to appear publicly because Vercel has to build and publish the new deployment.</w:t>
       </w:r>
     </w:p>
     <w:p>

</xml_diff>